<commit_message>
Update slides 3, number 42
</commit_message>
<xml_diff>
--- a/class03w.docx
+++ b/class03w.docx
@@ -4673,7 +4673,7 @@
     </w:p>
     <w:bookmarkEnd w:id="106"/>
     <w:bookmarkEnd w:id="107"/>
-    <w:bookmarkStart w:id="167" w:name="X1d27868a84f36aab16fec29310c010d5037eefd"/>
+    <w:bookmarkStart w:id="168" w:name="X1d27868a84f36aab16fec29310c010d5037eefd"/>
     <w:p>
       <w:pPr>
         <w:pStyle w:val="Heading1"/>
@@ -4912,21 +4912,13 @@
     </w:p>
     <w:bookmarkEnd w:id="109"/>
     <w:bookmarkEnd w:id="110"/>
-    <w:bookmarkStart w:id="111" w:name="returning-to-the-toothgrowth-data"/>
+    <w:bookmarkStart w:id="112" w:name="toothgrowth-summarizing-len"/>
     <w:p>
       <w:pPr>
         <w:pStyle w:val="Heading2"/>
       </w:pPr>
       <w:r>
-        <w:t xml:space="preserve">Returning to the ToothGrowth data</w:t>
-      </w:r>
-    </w:p>
-    <w:p>
-      <w:pPr>
-        <w:pStyle w:val="FirstParagraph"/>
-      </w:pPr>
-      <w:r>
-        <w:t xml:space="preserve">Numerical summaries of the</w:t>
+        <w:t xml:space="preserve">ToothGrowth Summarizing</w:t>
       </w:r>
       <w:r>
         <w:t xml:space="preserve"> </w:t>
@@ -4937,12 +4929,6 @@
         </w:rPr>
         <w:t xml:space="preserve">len</w:t>
       </w:r>
-      <w:r>
-        <w:t xml:space="preserve"> </w:t>
-      </w:r>
-      <w:r>
-        <w:t xml:space="preserve">variable:</w:t>
-      </w:r>
     </w:p>
     <w:p>
       <w:pPr>
@@ -5000,7 +4986,31 @@
         <w:rPr>
           <w:rStyle w:val="NormalTok"/>
         </w:rPr>
-        <w:t xml:space="preserve">()</w:t>
+        <w:t xml:space="preserve">(</w:t>
+      </w:r>
+      <w:r>
+        <w:rPr>
+          <w:rStyle w:val="AttributeTok"/>
+        </w:rPr>
+        <w:t xml:space="preserve">quartiles =</w:t>
+      </w:r>
+      <w:r>
+        <w:rPr>
+          <w:rStyle w:val="NormalTok"/>
+        </w:rPr>
+        <w:t xml:space="preserve"> </w:t>
+      </w:r>
+      <w:r>
+        <w:rPr>
+          <w:rStyle w:val="ConstantTok"/>
+        </w:rPr>
+        <w:t xml:space="preserve">TRUE</w:t>
+      </w:r>
+      <w:r>
+        <w:rPr>
+          <w:rStyle w:val="NormalTok"/>
+        </w:rPr>
+        <w:t xml:space="preserve">)</w:t>
       </w:r>
     </w:p>
     <w:p>
@@ -5011,25 +5021,55 @@
         <w:rPr>
           <w:rStyle w:val="VerbatimChar"/>
         </w:rPr>
-        <w:t xml:space="preserve">Variable |  Mean |   SD |   IQR |         Range | Skewness | Kurtosis |  n | n_Missing</w:t>
-      </w:r>
-      <w:r>
-        <w:br/>
-      </w:r>
-      <w:r>
-        <w:rPr>
-          <w:rStyle w:val="VerbatimChar"/>
-        </w:rPr>
-        <w:t xml:space="preserve">--------------------------------------------------------------------------------------</w:t>
-      </w:r>
-      <w:r>
-        <w:br/>
-      </w:r>
-      <w:r>
-        <w:rPr>
-          <w:rStyle w:val="VerbatimChar"/>
-        </w:rPr>
-        <w:t xml:space="preserve">len      | 18.81 | 7.65 | 13.40 | [4.20, 33.90] |    -0.15 |    -0.95 | 60 |         0</w:t>
+        <w:t xml:space="preserve">Variable |  Mean |   SD |   IQR |         Range |    Quartiles | Skewness</w:t>
+      </w:r>
+      <w:r>
+        <w:br/>
+      </w:r>
+      <w:r>
+        <w:rPr>
+          <w:rStyle w:val="VerbatimChar"/>
+        </w:rPr>
+        <w:t xml:space="preserve">-------------------------------------------------------------------------</w:t>
+      </w:r>
+      <w:r>
+        <w:br/>
+      </w:r>
+      <w:r>
+        <w:rPr>
+          <w:rStyle w:val="VerbatimChar"/>
+        </w:rPr>
+        <w:t xml:space="preserve">len      | 18.81 | 7.65 | 13.40 | [4.20, 33.90] | 13.07, 25.27 |    -0.15</w:t>
+      </w:r>
+      <w:r>
+        <w:br/>
+      </w:r>
+      <w:r>
+        <w:br/>
+      </w:r>
+      <w:r>
+        <w:rPr>
+          <w:rStyle w:val="VerbatimChar"/>
+        </w:rPr>
+        <w:t xml:space="preserve">Variable | Kurtosis |  n | n_Missing</w:t>
+      </w:r>
+      <w:r>
+        <w:br/>
+      </w:r>
+      <w:r>
+        <w:rPr>
+          <w:rStyle w:val="VerbatimChar"/>
+        </w:rPr>
+        <w:t xml:space="preserve">------------------------------------</w:t>
+      </w:r>
+      <w:r>
+        <w:br/>
+      </w:r>
+      <w:r>
+        <w:rPr>
+          <w:rStyle w:val="VerbatimChar"/>
+        </w:rPr>
+        <w:t xml:space="preserve">len      |    -0.95 | 60 |         0</w:t>
       </w:r>
     </w:p>
     <w:p>
@@ -5041,6 +5081,12 @@
         </w:numPr>
       </w:pPr>
       <w:r>
+        <w:t xml:space="preserve">The definition of</w:t>
+      </w:r>
+      <w:r>
+        <w:t xml:space="preserve"> </w:t>
+      </w:r>
+      <w:r>
         <w:rPr>
           <w:rStyle w:val="VerbatimChar"/>
         </w:rPr>
@@ -5077,7 +5123,44 @@
         <w:t xml:space="preserve">q25</w:t>
       </w:r>
       <w:r>
-        <w:t xml:space="preserve">, the interquartile range</w:t>
+        <w:t xml:space="preserve">, the interquartile range.</w:t>
+      </w:r>
+    </w:p>
+    <w:p>
+      <w:pPr>
+        <w:pStyle w:val="FirstParagraph"/>
+      </w:pPr>
+      <w:r>
+        <w:t xml:space="preserve">There are</w:t>
+      </w:r>
+      <w:r>
+        <w:t xml:space="preserve"> </w:t>
+      </w:r>
+      <w:hyperlink r:id="rId111">
+        <w:r>
+          <w:rPr>
+            <w:rStyle w:val="Hyperlink"/>
+          </w:rPr>
+          <w:t xml:space="preserve">9 different ways to calculate the quantiles</w:t>
+        </w:r>
+      </w:hyperlink>
+      <w:r>
+        <w:t xml:space="preserve">, and</w:t>
+      </w:r>
+      <w:r>
+        <w:t xml:space="preserve"> </w:t>
+      </w:r>
+      <w:r>
+        <w:rPr>
+          <w:rStyle w:val="VerbatimChar"/>
+        </w:rPr>
+        <w:t xml:space="preserve">describe_distribution()</w:t>
+      </w:r>
+      <w:r>
+        <w:t xml:space="preserve"> </w:t>
+      </w:r>
+      <w:r>
+        <w:t xml:space="preserve">unfortunately uses type 6 for IQR and type 7 (the default) for quartiles.</w:t>
       </w:r>
     </w:p>
     <w:p>
@@ -5086,27 +5169,33 @@
       </w:pPr>
       <w:r>
         <w:rPr>
-          <w:rStyle w:val="NormalTok"/>
-        </w:rPr>
-        <w:t xml:space="preserve">TG_new </w:t>
+          <w:rStyle w:val="FunctionTok"/>
+        </w:rPr>
+        <w:t xml:space="preserve">quantile</w:t>
+      </w:r>
+      <w:r>
+        <w:rPr>
+          <w:rStyle w:val="NormalTok"/>
+        </w:rPr>
+        <w:t xml:space="preserve">(TG_new</w:t>
       </w:r>
       <w:r>
         <w:rPr>
           <w:rStyle w:val="SpecialCharTok"/>
         </w:rPr>
-        <w:t xml:space="preserve">|&gt;</w:t>
-      </w:r>
-      <w:r>
-        <w:rPr>
-          <w:rStyle w:val="NormalTok"/>
-        </w:rPr>
-        <w:t xml:space="preserve"> </w:t>
+        <w:t xml:space="preserve">$</w:t>
+      </w:r>
+      <w:r>
+        <w:rPr>
+          <w:rStyle w:val="NormalTok"/>
+        </w:rPr>
+        <w:t xml:space="preserve">len, </w:t>
       </w:r>
       <w:r>
         <w:rPr>
           <w:rStyle w:val="FunctionTok"/>
         </w:rPr>
-        <w:t xml:space="preserve">reframe</w:t>
+        <w:t xml:space="preserve">c</w:t>
       </w:r>
       <w:r>
         <w:rPr>
@@ -5116,15 +5205,135 @@
       </w:r>
       <w:r>
         <w:rPr>
+          <w:rStyle w:val="FloatTok"/>
+        </w:rPr>
+        <w:t xml:space="preserve">0.25</w:t>
+      </w:r>
+      <w:r>
+        <w:rPr>
+          <w:rStyle w:val="NormalTok"/>
+        </w:rPr>
+        <w:t xml:space="preserve">,</w:t>
+      </w:r>
+      <w:r>
+        <w:rPr>
+          <w:rStyle w:val="FloatTok"/>
+        </w:rPr>
+        <w:t xml:space="preserve">0.75</w:t>
+      </w:r>
+      <w:r>
+        <w:rPr>
+          <w:rStyle w:val="NormalTok"/>
+        </w:rPr>
+        <w:t xml:space="preserve">), </w:t>
+      </w:r>
+      <w:r>
+        <w:rPr>
+          <w:rStyle w:val="AttributeTok"/>
+        </w:rPr>
+        <w:t xml:space="preserve">type =</w:t>
+      </w:r>
+      <w:r>
+        <w:rPr>
+          <w:rStyle w:val="NormalTok"/>
+        </w:rPr>
+        <w:t xml:space="preserve"> </w:t>
+      </w:r>
+      <w:r>
+        <w:rPr>
+          <w:rStyle w:val="DecValTok"/>
+        </w:rPr>
+        <w:t xml:space="preserve">6</w:t>
+      </w:r>
+      <w:r>
+        <w:rPr>
+          <w:rStyle w:val="NormalTok"/>
+        </w:rPr>
+        <w:t xml:space="preserve">); </w:t>
+      </w:r>
+      <w:r>
+        <w:rPr>
           <w:rStyle w:val="FunctionTok"/>
         </w:rPr>
-        <w:t xml:space="preserve">lovedist</w:t>
-      </w:r>
-      <w:r>
-        <w:rPr>
-          <w:rStyle w:val="NormalTok"/>
-        </w:rPr>
-        <w:t xml:space="preserve">(len))</w:t>
+        <w:t xml:space="preserve">quantile</w:t>
+      </w:r>
+      <w:r>
+        <w:rPr>
+          <w:rStyle w:val="NormalTok"/>
+        </w:rPr>
+        <w:t xml:space="preserve">(TG_new</w:t>
+      </w:r>
+      <w:r>
+        <w:rPr>
+          <w:rStyle w:val="SpecialCharTok"/>
+        </w:rPr>
+        <w:t xml:space="preserve">$</w:t>
+      </w:r>
+      <w:r>
+        <w:rPr>
+          <w:rStyle w:val="NormalTok"/>
+        </w:rPr>
+        <w:t xml:space="preserve">len, </w:t>
+      </w:r>
+      <w:r>
+        <w:rPr>
+          <w:rStyle w:val="FunctionTok"/>
+        </w:rPr>
+        <w:t xml:space="preserve">c</w:t>
+      </w:r>
+      <w:r>
+        <w:rPr>
+          <w:rStyle w:val="NormalTok"/>
+        </w:rPr>
+        <w:t xml:space="preserve">(</w:t>
+      </w:r>
+      <w:r>
+        <w:rPr>
+          <w:rStyle w:val="FloatTok"/>
+        </w:rPr>
+        <w:t xml:space="preserve">0.25</w:t>
+      </w:r>
+      <w:r>
+        <w:rPr>
+          <w:rStyle w:val="NormalTok"/>
+        </w:rPr>
+        <w:t xml:space="preserve">,</w:t>
+      </w:r>
+      <w:r>
+        <w:rPr>
+          <w:rStyle w:val="FloatTok"/>
+        </w:rPr>
+        <w:t xml:space="preserve">0.75</w:t>
+      </w:r>
+      <w:r>
+        <w:rPr>
+          <w:rStyle w:val="NormalTok"/>
+        </w:rPr>
+        <w:t xml:space="preserve">), </w:t>
+      </w:r>
+      <w:r>
+        <w:rPr>
+          <w:rStyle w:val="AttributeTok"/>
+        </w:rPr>
+        <w:t xml:space="preserve">type =</w:t>
+      </w:r>
+      <w:r>
+        <w:rPr>
+          <w:rStyle w:val="NormalTok"/>
+        </w:rPr>
+        <w:t xml:space="preserve"> </w:t>
+      </w:r>
+      <w:r>
+        <w:rPr>
+          <w:rStyle w:val="DecValTok"/>
+        </w:rPr>
+        <w:t xml:space="preserve">7</w:t>
+      </w:r>
+      <w:r>
+        <w:rPr>
+          <w:rStyle w:val="NormalTok"/>
+        </w:rPr>
+        <w:t xml:space="preserve">)</w:t>
       </w:r>
     </w:p>
     <w:p>
@@ -5135,38 +5344,40 @@
         <w:rPr>
           <w:rStyle w:val="VerbatimChar"/>
         </w:rPr>
-        <w:t xml:space="preserve"># A tibble: 1 × 10</w:t>
-      </w:r>
-      <w:r>
-        <w:br/>
-      </w:r>
-      <w:r>
-        <w:rPr>
-          <w:rStyle w:val="VerbatimChar"/>
-        </w:rPr>
-        <w:t xml:space="preserve">      n  miss  mean    sd   med   mad   min   q25   q75   max</w:t>
-      </w:r>
-      <w:r>
-        <w:br/>
-      </w:r>
-      <w:r>
-        <w:rPr>
-          <w:rStyle w:val="VerbatimChar"/>
-        </w:rPr>
-        <w:t xml:space="preserve">  &lt;int&gt; &lt;int&gt; &lt;dbl&gt; &lt;dbl&gt; &lt;dbl&gt; &lt;dbl&gt; &lt;dbl&gt; &lt;dbl&gt; &lt;dbl&gt; &lt;dbl&gt;</w:t>
-      </w:r>
-      <w:r>
-        <w:br/>
-      </w:r>
-      <w:r>
-        <w:rPr>
-          <w:rStyle w:val="VerbatimChar"/>
-        </w:rPr>
-        <w:t xml:space="preserve">1    60     0  18.8  7.65  19.2  9.04   4.2  13.1  25.3  33.9</w:t>
-      </w:r>
-    </w:p>
-    <w:bookmarkEnd w:id="111"/>
-    <w:bookmarkStart w:id="115" w:name="histogram-of-odontoblast-lengths"/>
+        <w:t xml:space="preserve">   25%    75% </w:t>
+      </w:r>
+      <w:r>
+        <w:br/>
+      </w:r>
+      <w:r>
+        <w:rPr>
+          <w:rStyle w:val="VerbatimChar"/>
+        </w:rPr>
+        <w:t xml:space="preserve">12.025 25.425 </w:t>
+      </w:r>
+    </w:p>
+    <w:p>
+      <w:pPr>
+        <w:pStyle w:val="SourceCode"/>
+      </w:pPr>
+      <w:r>
+        <w:rPr>
+          <w:rStyle w:val="VerbatimChar"/>
+        </w:rPr>
+        <w:t xml:space="preserve">   25%    75% </w:t>
+      </w:r>
+      <w:r>
+        <w:br/>
+      </w:r>
+      <w:r>
+        <w:rPr>
+          <w:rStyle w:val="VerbatimChar"/>
+        </w:rPr>
+        <w:t xml:space="preserve">13.075 25.275 </w:t>
+      </w:r>
+    </w:p>
+    <w:bookmarkEnd w:id="112"/>
+    <w:bookmarkStart w:id="116" w:name="histogram-of-odontoblast-lengths"/>
     <w:p>
       <w:pPr>
         <w:pStyle w:val="Heading2"/>
@@ -5287,18 +5498,18 @@
           <wp:inline>
             <wp:extent cx="4620126" cy="3696101"/>
             <wp:effectExtent b="0" l="0" r="0" t="0"/>
-            <wp:docPr descr="" title="" id="113" name="Picture"/>
+            <wp:docPr descr="" title="" id="114" name="Picture"/>
             <a:graphic>
               <a:graphicData uri="http://schemas.openxmlformats.org/drawingml/2006/picture">
                 <pic:pic>
                   <pic:nvPicPr>
-                    <pic:cNvPr descr="class03w_files/figure-docx/unnamed-chunk-13-1.png" id="114" name="Picture"/>
+                    <pic:cNvPr descr="class03w_files/figure-docx/unnamed-chunk-13-1.png" id="115" name="Picture"/>
                     <pic:cNvPicPr>
                       <a:picLocks noChangeArrowheads="1" noChangeAspect="1"/>
                     </pic:cNvPicPr>
                   </pic:nvPicPr>
                   <pic:blipFill>
-                    <a:blip r:embed="rId112"/>
+                    <a:blip r:embed="rId113"/>
                     <a:stretch>
                       <a:fillRect/>
                     </a:stretch>
@@ -5325,8 +5536,8 @@
         </w:drawing>
       </w:r>
     </w:p>
-    <w:bookmarkEnd w:id="115"/>
-    <w:bookmarkStart w:id="119" w:name="html-of-histogram-version-1"/>
+    <w:bookmarkEnd w:id="116"/>
+    <w:bookmarkStart w:id="120" w:name="html-of-histogram-version-1"/>
     <w:p>
       <w:pPr>
         <w:pStyle w:val="Heading2"/>
@@ -5344,18 +5555,18 @@
           <wp:inline>
             <wp:extent cx="5334000" cy="3598488"/>
             <wp:effectExtent b="0" l="0" r="0" t="0"/>
-            <wp:docPr descr="" title="" id="117" name="Picture"/>
+            <wp:docPr descr="" title="" id="118" name="Picture"/>
             <a:graphic>
               <a:graphicData uri="http://schemas.openxmlformats.org/drawingml/2006/picture">
                 <pic:pic>
                   <pic:nvPicPr>
-                    <pic:cNvPr descr="c03/images/teeth_02.png" id="118" name="Picture"/>
+                    <pic:cNvPr descr="c03/images/teeth_02.png" id="119" name="Picture"/>
                     <pic:cNvPicPr>
                       <a:picLocks noChangeArrowheads="1" noChangeAspect="1"/>
                     </pic:cNvPicPr>
                   </pic:nvPicPr>
                   <pic:blipFill>
-                    <a:blip r:embed="rId116"/>
+                    <a:blip r:embed="rId117"/>
                     <a:stretch>
                       <a:fillRect/>
                     </a:stretch>
@@ -5382,8 +5593,8 @@
         </w:drawing>
       </w:r>
     </w:p>
-    <w:bookmarkEnd w:id="119"/>
-    <w:bookmarkStart w:id="123" w:name="version-2-set-bin-width-and-colors"/>
+    <w:bookmarkEnd w:id="120"/>
+    <w:bookmarkStart w:id="124" w:name="version-2-set-bin-width-and-colors"/>
     <w:p>
       <w:pPr>
         <w:pStyle w:val="Heading2"/>
@@ -5553,18 +5764,18 @@
           <wp:inline>
             <wp:extent cx="4620126" cy="3696101"/>
             <wp:effectExtent b="0" l="0" r="0" t="0"/>
-            <wp:docPr descr="" title="" id="121" name="Picture"/>
+            <wp:docPr descr="" title="" id="122" name="Picture"/>
             <a:graphic>
               <a:graphicData uri="http://schemas.openxmlformats.org/drawingml/2006/picture">
                 <pic:pic>
                   <pic:nvPicPr>
-                    <pic:cNvPr descr="class03w_files/figure-docx/unnamed-chunk-14-1.png" id="122" name="Picture"/>
+                    <pic:cNvPr descr="class03w_files/figure-docx/unnamed-chunk-14-1.png" id="123" name="Picture"/>
                     <pic:cNvPicPr>
                       <a:picLocks noChangeArrowheads="1" noChangeAspect="1"/>
                     </pic:cNvPicPr>
                   </pic:nvPicPr>
                   <pic:blipFill>
-                    <a:blip r:embed="rId120"/>
+                    <a:blip r:embed="rId121"/>
                     <a:stretch>
                       <a:fillRect/>
                     </a:stretch>
@@ -5591,8 +5802,8 @@
         </w:drawing>
       </w:r>
     </w:p>
-    <w:bookmarkEnd w:id="123"/>
-    <w:bookmarkStart w:id="127" w:name="html-of-histogram-version-2"/>
+    <w:bookmarkEnd w:id="124"/>
+    <w:bookmarkStart w:id="128" w:name="html-of-histogram-version-2"/>
     <w:p>
       <w:pPr>
         <w:pStyle w:val="Heading2"/>
@@ -5610,18 +5821,18 @@
           <wp:inline>
             <wp:extent cx="5334000" cy="3935481"/>
             <wp:effectExtent b="0" l="0" r="0" t="0"/>
-            <wp:docPr descr="" title="" id="125" name="Picture"/>
+            <wp:docPr descr="" title="" id="126" name="Picture"/>
             <a:graphic>
               <a:graphicData uri="http://schemas.openxmlformats.org/drawingml/2006/picture">
                 <pic:pic>
                   <pic:nvPicPr>
-                    <pic:cNvPr descr="c03/images/teeth_03.png" id="126" name="Picture"/>
+                    <pic:cNvPr descr="c03/images/teeth_03.png" id="127" name="Picture"/>
                     <pic:cNvPicPr>
                       <a:picLocks noChangeArrowheads="1" noChangeAspect="1"/>
                     </pic:cNvPicPr>
                   </pic:nvPicPr>
                   <pic:blipFill>
-                    <a:blip r:embed="rId124"/>
+                    <a:blip r:embed="rId125"/>
                     <a:stretch>
                       <a:fillRect/>
                     </a:stretch>
@@ -5648,8 +5859,8 @@
         </w:drawing>
       </w:r>
     </w:p>
-    <w:bookmarkEnd w:id="127"/>
-    <w:bookmarkStart w:id="131" w:name="version-3-try-10-bins-set-labels"/>
+    <w:bookmarkEnd w:id="128"/>
+    <w:bookmarkStart w:id="132" w:name="version-3-try-10-bins-set-labels"/>
     <w:p>
       <w:pPr>
         <w:pStyle w:val="Heading2"/>
@@ -5927,18 +6138,18 @@
           <wp:inline>
             <wp:extent cx="4620126" cy="3696101"/>
             <wp:effectExtent b="0" l="0" r="0" t="0"/>
-            <wp:docPr descr="" title="" id="129" name="Picture"/>
+            <wp:docPr descr="" title="" id="130" name="Picture"/>
             <a:graphic>
               <a:graphicData uri="http://schemas.openxmlformats.org/drawingml/2006/picture">
                 <pic:pic>
                   <pic:nvPicPr>
-                    <pic:cNvPr descr="class03w_files/figure-docx/unnamed-chunk-15-1.png" id="130" name="Picture"/>
+                    <pic:cNvPr descr="class03w_files/figure-docx/unnamed-chunk-15-1.png" id="131" name="Picture"/>
                     <pic:cNvPicPr>
                       <a:picLocks noChangeArrowheads="1" noChangeAspect="1"/>
                     </pic:cNvPicPr>
                   </pic:nvPicPr>
                   <pic:blipFill>
-                    <a:blip r:embed="rId128"/>
+                    <a:blip r:embed="rId129"/>
                     <a:stretch>
                       <a:fillRect/>
                     </a:stretch>
@@ -5965,8 +6176,8 @@
         </w:drawing>
       </w:r>
     </w:p>
-    <w:bookmarkEnd w:id="131"/>
-    <w:bookmarkStart w:id="132" w:name="estimating-the-mean-len"/>
+    <w:bookmarkEnd w:id="132"/>
+    <w:bookmarkStart w:id="133" w:name="estimating-the-mean-len"/>
     <w:p>
       <w:pPr>
         <w:pStyle w:val="Heading2"/>
@@ -6182,8 +6393,8 @@
         <w:t xml:space="preserve">Our linear model for the mean odontoblast length provides a point estimate (sample mean) of 18.81 with a 95% confidence interval ranging from 16.84 to 20.79.</w:t>
       </w:r>
     </w:p>
-    <w:bookmarkEnd w:id="132"/>
-    <w:bookmarkStart w:id="133" w:name="how-is-dose-related-to-length"/>
+    <w:bookmarkEnd w:id="133"/>
+    <w:bookmarkStart w:id="134" w:name="how-is-dose-related-to-length"/>
     <w:p>
       <w:pPr>
         <w:pStyle w:val="Heading2"/>
@@ -6292,8 +6503,8 @@
         <w:t xml:space="preserve">)?</w:t>
       </w:r>
     </w:p>
-    <w:bookmarkEnd w:id="133"/>
-    <w:bookmarkStart w:id="137" w:name="plotting-len-by-dose"/>
+    <w:bookmarkEnd w:id="134"/>
+    <w:bookmarkStart w:id="138" w:name="plotting-len-by-dose"/>
     <w:p>
       <w:pPr>
         <w:pStyle w:val="Heading2"/>
@@ -6418,18 +6629,18 @@
           <wp:inline>
             <wp:extent cx="4620126" cy="3696101"/>
             <wp:effectExtent b="0" l="0" r="0" t="0"/>
-            <wp:docPr descr="" title="" id="135" name="Picture"/>
+            <wp:docPr descr="" title="" id="136" name="Picture"/>
             <a:graphic>
               <a:graphicData uri="http://schemas.openxmlformats.org/drawingml/2006/picture">
                 <pic:pic>
                   <pic:nvPicPr>
-                    <pic:cNvPr descr="class03w_files/figure-docx/unnamed-chunk-17-1.png" id="136" name="Picture"/>
+                    <pic:cNvPr descr="class03w_files/figure-docx/unnamed-chunk-17-1.png" id="137" name="Picture"/>
                     <pic:cNvPicPr>
                       <a:picLocks noChangeArrowheads="1" noChangeAspect="1"/>
                     </pic:cNvPicPr>
                   </pic:nvPicPr>
                   <pic:blipFill>
-                    <a:blip r:embed="rId134"/>
+                    <a:blip r:embed="rId135"/>
                     <a:stretch>
                       <a:fillRect/>
                     </a:stretch>
@@ -6456,8 +6667,8 @@
         </w:drawing>
       </w:r>
     </w:p>
-    <w:bookmarkEnd w:id="137"/>
-    <w:bookmarkStart w:id="141" w:name="treat-dose-as-a-categorical-factor"/>
+    <w:bookmarkEnd w:id="138"/>
+    <w:bookmarkStart w:id="142" w:name="treat-dose-as-a-categorical-factor"/>
     <w:p>
       <w:pPr>
         <w:pStyle w:val="Heading2"/>
@@ -6643,18 +6854,18 @@
           <wp:inline>
             <wp:extent cx="4620126" cy="3696101"/>
             <wp:effectExtent b="0" l="0" r="0" t="0"/>
-            <wp:docPr descr="" title="" id="139" name="Picture"/>
+            <wp:docPr descr="" title="" id="140" name="Picture"/>
             <a:graphic>
               <a:graphicData uri="http://schemas.openxmlformats.org/drawingml/2006/picture">
                 <pic:pic>
                   <pic:nvPicPr>
-                    <pic:cNvPr descr="class03w_files/figure-docx/unnamed-chunk-18-1.png" id="140" name="Picture"/>
+                    <pic:cNvPr descr="class03w_files/figure-docx/unnamed-chunk-18-1.png" id="141" name="Picture"/>
                     <pic:cNvPicPr>
                       <a:picLocks noChangeArrowheads="1" noChangeAspect="1"/>
                     </pic:cNvPicPr>
                   </pic:nvPicPr>
                   <pic:blipFill>
-                    <a:blip r:embed="rId138"/>
+                    <a:blip r:embed="rId139"/>
                     <a:stretch>
                       <a:fillRect/>
                     </a:stretch>
@@ -6681,8 +6892,8 @@
         </w:drawing>
       </w:r>
     </w:p>
-    <w:bookmarkEnd w:id="141"/>
-    <w:bookmarkStart w:id="145" w:name="add-boxplots-sample-means"/>
+    <w:bookmarkEnd w:id="142"/>
+    <w:bookmarkStart w:id="146" w:name="add-boxplots-sample-means"/>
     <w:p>
       <w:pPr>
         <w:pStyle w:val="Heading2"/>
@@ -6990,18 +7201,18 @@
           <wp:inline>
             <wp:extent cx="4620126" cy="3696101"/>
             <wp:effectExtent b="0" l="0" r="0" t="0"/>
-            <wp:docPr descr="" title="" id="143" name="Picture"/>
+            <wp:docPr descr="" title="" id="144" name="Picture"/>
             <a:graphic>
               <a:graphicData uri="http://schemas.openxmlformats.org/drawingml/2006/picture">
                 <pic:pic>
                   <pic:nvPicPr>
-                    <pic:cNvPr descr="class03w_files/figure-docx/unnamed-chunk-19-1.png" id="144" name="Picture"/>
+                    <pic:cNvPr descr="class03w_files/figure-docx/unnamed-chunk-19-1.png" id="145" name="Picture"/>
                     <pic:cNvPicPr>
                       <a:picLocks noChangeArrowheads="1" noChangeAspect="1"/>
                     </pic:cNvPicPr>
                   </pic:nvPicPr>
                   <pic:blipFill>
-                    <a:blip r:embed="rId142"/>
+                    <a:blip r:embed="rId143"/>
                     <a:stretch>
                       <a:fillRect/>
                     </a:stretch>
@@ -7028,8 +7239,8 @@
         </w:drawing>
       </w:r>
     </w:p>
-    <w:bookmarkEnd w:id="145"/>
-    <w:bookmarkStart w:id="146" w:name="numerical-summary-len-by-dose"/>
+    <w:bookmarkEnd w:id="146"/>
+    <w:bookmarkStart w:id="147" w:name="numerical-summary-len-by-dose"/>
     <w:p>
       <w:pPr>
         <w:pStyle w:val="Heading2"/>
@@ -7330,8 +7541,8 @@
         <w:t xml:space="preserve">of the data?</w:t>
       </w:r>
     </w:p>
-    <w:bookmarkEnd w:id="146"/>
-    <w:bookmarkStart w:id="150" w:name="length-and-supply-method"/>
+    <w:bookmarkEnd w:id="147"/>
+    <w:bookmarkStart w:id="151" w:name="length-and-supply-method"/>
     <w:p>
       <w:pPr>
         <w:pStyle w:val="Heading2"/>
@@ -7876,18 +8087,18 @@
           <wp:inline>
             <wp:extent cx="4620126" cy="3696101"/>
             <wp:effectExtent b="0" l="0" r="0" t="0"/>
-            <wp:docPr descr="" title="" id="148" name="Picture"/>
+            <wp:docPr descr="" title="" id="149" name="Picture"/>
             <a:graphic>
               <a:graphicData uri="http://schemas.openxmlformats.org/drawingml/2006/picture">
                 <pic:pic>
                   <pic:nvPicPr>
-                    <pic:cNvPr descr="class03w_files/figure-docx/unnamed-chunk-21-1.png" id="149" name="Picture"/>
+                    <pic:cNvPr descr="class03w_files/figure-docx/unnamed-chunk-21-1.png" id="150" name="Picture"/>
                     <pic:cNvPicPr>
                       <a:picLocks noChangeArrowheads="1" noChangeAspect="1"/>
                     </pic:cNvPicPr>
                   </pic:nvPicPr>
                   <pic:blipFill>
-                    <a:blip r:embed="rId147"/>
+                    <a:blip r:embed="rId148"/>
                     <a:stretch>
                       <a:fillRect/>
                     </a:stretch>
@@ -7914,8 +8125,8 @@
         </w:drawing>
       </w:r>
     </w:p>
-    <w:bookmarkEnd w:id="150"/>
-    <w:bookmarkStart w:id="151" w:name="lengths-within-each-supply-method"/>
+    <w:bookmarkEnd w:id="151"/>
+    <w:bookmarkStart w:id="152" w:name="lengths-within-each-supply-method"/>
     <w:p>
       <w:pPr>
         <w:pStyle w:val="Heading2"/>
@@ -8051,8 +8262,8 @@
         <w:t xml:space="preserve">2 VC       30     0  17.0  8.27  16.5  9.27   4.2  11.2  23.1  33.9</w:t>
       </w:r>
     </w:p>
-    <w:bookmarkEnd w:id="151"/>
-    <w:bookmarkStart w:id="152" w:name="X6b918ba44264cf981b0ea25beb5a6454a4ac843"/>
+    <w:bookmarkEnd w:id="152"/>
+    <w:bookmarkStart w:id="153" w:name="X6b918ba44264cf981b0ea25beb5a6454a4ac843"/>
     <w:p>
       <w:pPr>
         <w:pStyle w:val="Heading2"/>
@@ -8263,8 +8474,8 @@
         <w:t xml:space="preserve">Our model for the difference in mean length suggests that the OJ animals had odontoblasts that were 3.7 μm longer, with 95% confidence interval -0.17 to 7.57 μm.</w:t>
       </w:r>
     </w:p>
-    <w:bookmarkEnd w:id="152"/>
-    <w:bookmarkStart w:id="153" w:name="what-if-we-dont-specify-supp-oj"/>
+    <w:bookmarkEnd w:id="153"/>
+    <w:bookmarkStart w:id="154" w:name="what-if-we-dont-specify-supp-oj"/>
     <w:p>
       <w:pPr>
         <w:pStyle w:val="Heading2"/>
@@ -8467,8 +8678,8 @@
         <w:t xml:space="preserve">Previous slide: OJ were 3.7 μm longer (95% CI: -0.17, 7.57).</w:t>
       </w:r>
     </w:p>
-    <w:bookmarkEnd w:id="153"/>
-    <w:bookmarkStart w:id="154" w:name="consider-both-dose-and-supp"/>
+    <w:bookmarkEnd w:id="154"/>
+    <w:bookmarkStart w:id="155" w:name="consider-both-dose-and-supp"/>
     <w:p>
       <w:pPr>
         <w:pStyle w:val="Heading2"/>
@@ -8584,8 +8795,8 @@
         <w:t xml:space="preserve">method?</w:t>
       </w:r>
     </w:p>
-    <w:bookmarkEnd w:id="154"/>
-    <w:bookmarkStart w:id="155" w:name="summarizing-len-by-dose-and-supp"/>
+    <w:bookmarkEnd w:id="155"/>
+    <w:bookmarkStart w:id="156" w:name="summarizing-len-by-dose-and-supp"/>
     <w:p>
       <w:pPr>
         <w:pStyle w:val="Heading2"/>
@@ -8843,8 +9054,8 @@
         <w:t xml:space="preserve">…</w:t>
       </w:r>
     </w:p>
-    <w:bookmarkEnd w:id="155"/>
-    <w:bookmarkStart w:id="159" w:name="impact-of-dose-and-supp"/>
+    <w:bookmarkEnd w:id="156"/>
+    <w:bookmarkStart w:id="160" w:name="impact-of-dose-and-supp"/>
     <w:p>
       <w:pPr>
         <w:pStyle w:val="Heading2"/>
@@ -9257,18 +9468,18 @@
           <wp:inline>
             <wp:extent cx="4620126" cy="3696101"/>
             <wp:effectExtent b="0" l="0" r="0" t="0"/>
-            <wp:docPr descr="" title="" id="157" name="Picture"/>
+            <wp:docPr descr="" title="" id="158" name="Picture"/>
             <a:graphic>
               <a:graphicData uri="http://schemas.openxmlformats.org/drawingml/2006/picture">
                 <pic:pic>
                   <pic:nvPicPr>
-                    <pic:cNvPr descr="class03w_files/figure-docx/unnamed-chunk-26-1.png" id="158" name="Picture"/>
+                    <pic:cNvPr descr="class03w_files/figure-docx/unnamed-chunk-26-1.png" id="159" name="Picture"/>
                     <pic:cNvPicPr>
                       <a:picLocks noChangeArrowheads="1" noChangeAspect="1"/>
                     </pic:cNvPicPr>
                   </pic:nvPicPr>
                   <pic:blipFill>
-                    <a:blip r:embed="rId156"/>
+                    <a:blip r:embed="rId157"/>
                     <a:stretch>
                       <a:fillRect/>
                     </a:stretch>
@@ -9295,8 +9506,8 @@
         </w:drawing>
       </w:r>
     </w:p>
-    <w:bookmarkEnd w:id="159"/>
-    <w:bookmarkStart w:id="163" w:name="length-by-supply-facets-by-dose"/>
+    <w:bookmarkEnd w:id="160"/>
+    <w:bookmarkStart w:id="164" w:name="length-by-supply-facets-by-dose"/>
     <w:p>
       <w:pPr>
         <w:pStyle w:val="Heading2"/>
@@ -9892,18 +10103,18 @@
           <wp:inline>
             <wp:extent cx="4620126" cy="3696101"/>
             <wp:effectExtent b="0" l="0" r="0" t="0"/>
-            <wp:docPr descr="" title="" id="161" name="Picture"/>
+            <wp:docPr descr="" title="" id="162" name="Picture"/>
             <a:graphic>
               <a:graphicData uri="http://schemas.openxmlformats.org/drawingml/2006/picture">
                 <pic:pic>
                   <pic:nvPicPr>
-                    <pic:cNvPr descr="class03w_files/figure-docx/unnamed-chunk-27-1.png" id="162" name="Picture"/>
+                    <pic:cNvPr descr="class03w_files/figure-docx/unnamed-chunk-27-1.png" id="163" name="Picture"/>
                     <pic:cNvPicPr>
                       <a:picLocks noChangeArrowheads="1" noChangeAspect="1"/>
                     </pic:cNvPicPr>
                   </pic:nvPicPr>
                   <pic:blipFill>
-                    <a:blip r:embed="rId160"/>
+                    <a:blip r:embed="rId161"/>
                     <a:stretch>
                       <a:fillRect/>
                     </a:stretch>
@@ -9930,8 +10141,8 @@
         </w:drawing>
       </w:r>
     </w:p>
-    <w:bookmarkEnd w:id="163"/>
-    <w:bookmarkStart w:id="164" w:name="recap-what-have-we-done"/>
+    <w:bookmarkEnd w:id="164"/>
+    <w:bookmarkStart w:id="165" w:name="recap-what-have-we-done"/>
     <w:p>
       <w:pPr>
         <w:pStyle w:val="Heading2"/>
@@ -10078,8 +10289,8 @@
         <w:t xml:space="preserve">Estimating confidence intervals for one mean, or comparing two means, using a linear model</w:t>
       </w:r>
     </w:p>
-    <w:bookmarkEnd w:id="164"/>
-    <w:bookmarkStart w:id="165" w:name="next-time"/>
+    <w:bookmarkEnd w:id="165"/>
+    <w:bookmarkStart w:id="166" w:name="next-time"/>
     <w:p>
       <w:pPr>
         <w:pStyle w:val="Heading2"/>
@@ -10199,8 +10410,8 @@
         <w:t xml:space="preserve">Minute Paper after Class 3.</w:t>
       </w:r>
     </w:p>
-    <w:bookmarkEnd w:id="165"/>
-    <w:bookmarkStart w:id="166" w:name="session-information"/>
+    <w:bookmarkEnd w:id="166"/>
+    <w:bookmarkStart w:id="167" w:name="session-information"/>
     <w:p>
       <w:pPr>
         <w:pStyle w:val="Heading2"/>
@@ -10423,16 +10634,16 @@
         <w:rPr>
           <w:rStyle w:val="VerbatimChar"/>
         </w:rPr>
-        <w:t xml:space="preserve">  crayon_1.5.3         crosstalk_1.2.2      curl_7.1.0          </w:t>
-      </w:r>
-      <w:r>
-        <w:br/>
-      </w:r>
-      <w:r>
-        <w:rPr>
-          <w:rStyle w:val="VerbatimChar"/>
-        </w:rPr>
-        <w:t xml:space="preserve">  data.table_1.18.4    datasets_4.6.1       datawizard_1.3.1    </w:t>
+        <w:t xml:space="preserve">  crayon_1.5.3         crosstalk_1.2.2      curl_8.0.0          </w:t>
+      </w:r>
+      <w:r>
+        <w:br/>
+      </w:r>
+      <w:r>
+        <w:rPr>
+          <w:rStyle w:val="VerbatimChar"/>
+        </w:rPr>
+        <w:t xml:space="preserve">  data.table_1.18.6.1  datasets_4.6.1       datawizard_1.3.1    </w:t>
       </w:r>
       <w:r>
         <w:br/>
@@ -10639,7 +10850,7 @@
         <w:rPr>
           <w:rStyle w:val="VerbatimChar"/>
         </w:rPr>
-        <w:t xml:space="preserve">  miniUI_0.1.2         minqa_1.2.8          modelbased_0.16.0   </w:t>
+        <w:t xml:space="preserve">  miniUI_0.1.2         minqa_1.2.8          modelbased_0.17.0   </w:t>
       </w:r>
       <w:r>
         <w:br/>
@@ -10675,7 +10886,7 @@
         <w:rPr>
           <w:rStyle w:val="VerbatimChar"/>
         </w:rPr>
-        <w:t xml:space="preserve">  parameters_0.29.2    patchwork_1.3.2      performance_0.17.1  </w:t>
+        <w:t xml:space="preserve">  parameters_0.29.2    patchwork_1.3.2      performance_0.18.0  </w:t>
       </w:r>
       <w:r>
         <w:br/>
@@ -10783,7 +10994,7 @@
         <w:rPr>
           <w:rStyle w:val="VerbatimChar"/>
         </w:rPr>
-        <w:t xml:space="preserve">  rstanarm_2.32.2      rstantools_2.7.0     rstudioapi_0.19.0   </w:t>
+        <w:t xml:space="preserve">  rstanarm_2.32.2      rstantools_2.7.1     rstudioapi_0.19.0   </w:t>
       </w:r>
       <w:r>
         <w:br/>
@@ -10930,8 +11141,8 @@
         <w:t xml:space="preserve">  xts_0.14.2           yaml_2.3.12          zoo_1.9-0           </w:t>
       </w:r>
     </w:p>
-    <w:bookmarkEnd w:id="166"/>
     <w:bookmarkEnd w:id="167"/>
+    <w:bookmarkEnd w:id="168"/>
     <w:sectPr>
       <w:footnotePr>
         <w:numRestart w:val="eachSect"/>

</xml_diff>